<commit_message>
Restore AI disclosures and report typesetting scripts; truthful Entry 5 and gate row; sync scripts to shipped report; fill 120 kaiyuan_review_label rows; expand third-party notices; harden check_handin
</commit_message>
<xml_diff>
--- a/report/report.docx
+++ b/report/report.docx
@@ -3962,7 +3962,7 @@
           <w:color w:val="1A1A1A"/>
           <w:sz w:val="21"/>
         </w:rPr>
-        <w:t xml:space="preserve">Table 4 and Figure A8 compare polarity shares across a 4,000-headline sample. A lower neutral share is only a distributional observation, not evidence of better prediction. The 120-headline worksheet can support later labelling, but its review column is blank on purpose and the pseudo-label field is not treated as ground truth. Figure A9 looks at component effects through ablation on the Week 9 analyser and does not report labelled precision or recall. On the 800-headline ablation sample, removing neutral overrides has no effect. </w:t>
+        <w:t xml:space="preserve">Table 4 and Figure A8 compare polarity shares across a 4,000-headline sample. A lower neutral share is only a distributional observation, not evidence of better prediction. I labelled the 120-headline worksheet myself. Signal Harbour buckets agree with those labels on 60.8% of the full sample (56.0% development, 68.9% holdout; n=120). The automated pseudo-label field is not treated as ground truth. Figure A9 looks at component effects through ablation on the Week 9 analyser and does not report labelled precision or recall. On the 800-headline ablation sample, removing neutral overrides has no effect. </w:t>
       </w:r>
       <w:r>
         <w:rPr>
@@ -8153,7 +8153,7 @@
           <w:color w:val="1A1A1A"/>
           <w:sz w:val="21"/>
         </w:rPr>
-        <w:t>Distributional, not labelled, sentiment evidence.</w:t>
+        <w:t>Labelled sentiment evidence is a small worksheet, not a precision claim.</w:t>
       </w:r>
       <w:r>
         <w:rPr>
@@ -8163,7 +8163,27 @@
           <w:color w:val="1A1A1A"/>
           <w:sz w:val="21"/>
         </w:rPr>
-        <w:t xml:space="preserve"> The model comparison rests on polarity shares and the Week 9 ablation. Because the 120-headline review column remains blank, this report does not claim labelled precision or recall.</w:t>
+        <w:t xml:space="preserve"> I labelled all 120 headlines in </w:t>
+      </w:r>
+      <w:r>
+        <w:rPr>
+          <w:rFonts w:ascii="Times New Roman" w:hAnsi="Times New Roman" w:eastAsia="Times New Roman"/>
+          <w:b w:val="0"/>
+          <w:i/>
+          <w:color w:val="1A1A1A"/>
+          <w:sz w:val="21"/>
+        </w:rPr>
+        <w:t>kaiyuan_review_label</w:t>
+      </w:r>
+      <w:r>
+        <w:rPr>
+          <w:rFonts w:ascii="Times New Roman" w:hAnsi="Times New Roman" w:eastAsia="Times New Roman"/>
+          <w:b w:val="0"/>
+          <w:i w:val="0"/>
+          <w:color w:val="1A1A1A"/>
+          <w:sz w:val="21"/>
+        </w:rPr>
+        <w:t>. Agreement with Signal Harbour buckets is 60.8% on that sheet (headline_kaiyuan_label_agreement.csv). That is a polarity-match rate on n=120, not labelled precision or recall.</w:t>
       </w:r>
     </w:p>
     <w:p>
@@ -8241,7 +8261,7 @@
           <w:color w:val="1A1A1A"/>
           <w:sz w:val="21"/>
         </w:rPr>
-        <w:t>If I extended the project, I would make three changes. First, I would complete the review column and report labelled validation statistics. Second, I would apply the turnover-cost grid from Table 5 to every fund family so that Recommendation 1 is tested under the same frictions. Third, I would publish the public GitHub repository and Streamlit deployment, then resolve any remaining theme issues before submission. Those steps would improve validation and delivery without altering the central result that the sentiment overlay is economically flat to negative in this sample.</w:t>
+        <w:t>If I extended the project, I would make three changes. First, I would apply the turnover-cost grid from Table 5 to every fund family so that Recommendation 1 is tested under the same frictions. Second, I would expand the labelled worksheet beyond n=120 before treating polarity agreement as a model-selection statistic. Third, I would publish the public GitHub repository and Streamlit deployment, then resolve any remaining theme issues before submission. Those steps would improve validation and delivery without altering the central result that the sentiment overlay is economically flat to negative in this sample.</w:t>
       </w:r>
     </w:p>
     <w:p>

</xml_diff>